<commit_message>
Cultivar variants added for all banned berries in items.txt
</commit_message>
<xml_diff>
--- a/Plugins/TDW Berry Planting Improvements/Setup and Documentation.docx
+++ b/Plugins/TDW Berry Planting Improvements/Setup and Documentation.docx
@@ -141,29 +141,56 @@
           <w:ilvl w:val="0"/>
           <w:numId w:val="1"/>
         </w:numPr>
-      </w:pPr>
-      <w:r>
+        <w:rPr>
+          <w:highlight w:val="red"/>
+        </w:rPr>
+      </w:pPr>
+      <w:r>
+        <w:rPr>
+          <w:highlight w:val="red"/>
+        </w:rPr>
         <w:t>Move the files in the</w:t>
       </w:r>
       <w:r>
+        <w:rPr>
+          <w:highlight w:val="red"/>
+        </w:rPr>
         <w:t xml:space="preserve"> </w:t>
       </w:r>
       <w:r>
+        <w:rPr>
+          <w:highlight w:val="red"/>
+        </w:rPr>
         <w:t xml:space="preserve">Graphics </w:t>
       </w:r>
       <w:r>
+        <w:rPr>
+          <w:highlight w:val="red"/>
+        </w:rPr>
         <w:t xml:space="preserve">folder </w:t>
       </w:r>
       <w:r>
+        <w:rPr>
+          <w:highlight w:val="red"/>
+        </w:rPr>
         <w:t>included</w:t>
       </w:r>
       <w:r>
+        <w:rPr>
+          <w:highlight w:val="red"/>
+        </w:rPr>
         <w:t xml:space="preserve"> into </w:t>
       </w:r>
       <w:r>
+        <w:rPr>
+          <w:highlight w:val="red"/>
+        </w:rPr>
         <w:t>your project’s Plugins folder</w:t>
       </w:r>
       <w:r>
+        <w:rPr>
+          <w:highlight w:val="red"/>
+        </w:rPr>
         <w:t>.</w:t>
       </w:r>
     </w:p>
@@ -174,15 +201,15 @@
           <w:ilvl w:val="0"/>
           <w:numId w:val="1"/>
         </w:numPr>
-      </w:pPr>
-      <w:r>
-        <w:t xml:space="preserve">If you want to use the new mulch items, add the items listed in the PBS &gt; </w:t>
-      </w:r>
-      <w:r>
-        <w:t>items_newmulch</w:t>
-      </w:r>
-      <w:r>
-        <w:t>.txt to your PBS &gt; items.txt file (or copy the file to your PBS folder for v21+).</w:t>
+        <w:rPr>
+          <w:highlight w:val="red"/>
+        </w:rPr>
+      </w:pPr>
+      <w:r>
+        <w:rPr>
+          <w:highlight w:val="red"/>
+        </w:rPr>
+        <w:t>If you want to use the new mulch items, add the items listed in the PBS &gt; items_newmulch.txt to your PBS &gt; items.txt file (or copy the file to your PBS folder for v21+).</w:t>
       </w:r>
     </w:p>
     <w:p>
@@ -627,24 +654,39 @@
         </w:numPr>
       </w:pPr>
       <w:r>
+        <w:rPr>
+          <w:highlight w:val="red"/>
+        </w:rPr>
         <w:t xml:space="preserve">Explore the settings in </w:t>
       </w:r>
       <w:r>
+        <w:rPr>
+          <w:highlight w:val="red"/>
+        </w:rPr>
         <w:t xml:space="preserve">Plugins &gt; </w:t>
       </w:r>
       <w:r>
+        <w:rPr>
+          <w:highlight w:val="red"/>
+        </w:rPr>
         <w:t xml:space="preserve">TDW </w:t>
       </w:r>
       <w:r>
+        <w:rPr>
+          <w:highlight w:val="red"/>
+        </w:rPr>
         <w:t xml:space="preserve">Planting Improvements </w:t>
       </w:r>
       <w:r>
-        <w:t xml:space="preserve">&gt; </w:t>
-      </w:r>
-      <w:r>
-        <w:t>000_Settings</w:t>
-      </w:r>
-      <w:r>
+        <w:rPr>
+          <w:highlight w:val="red"/>
+        </w:rPr>
+        <w:t>&gt; 000_Settings</w:t>
+      </w:r>
+      <w:r>
+        <w:rPr>
+          <w:highlight w:val="red"/>
+        </w:rPr>
         <w:t>.</w:t>
       </w:r>
     </w:p>
@@ -1208,12 +1250,14 @@
         <w:rPr>
           <w:b/>
           <w:bCs/>
+          <w:highlight w:val="red"/>
         </w:rPr>
       </w:pPr>
       <w:r>
         <w:rPr>
           <w:b/>
           <w:bCs/>
+          <w:highlight w:val="red"/>
         </w:rPr>
         <w:t xml:space="preserve">Watering </w:t>
       </w:r>
@@ -1221,6 +1265,7 @@
         <w:rPr>
           <w:b/>
           <w:bCs/>
+          <w:highlight w:val="red"/>
         </w:rPr>
         <w:t>Features - Animation</w:t>
       </w:r>
@@ -1232,30 +1277,37 @@
           <w:ilvl w:val="0"/>
           <w:numId w:val="14"/>
         </w:numPr>
-      </w:pPr>
-      <w:r>
-        <w:t xml:space="preserve">If you’d like to show watering animations when watering a berry plant, make sure to set </w:t>
-      </w:r>
-      <w:r>
-        <w:t>BERRY_WATERING_SPRITES</w:t>
-      </w:r>
-      <w:r>
-        <w:t xml:space="preserve"> in 000_Settings to include file names for each of the trainers in your game. You must also include the appropriate images in the Graphics &gt; Characters folder (I suggest </w:t>
+        <w:rPr>
+          <w:highlight w:val="red"/>
+        </w:rPr>
+      </w:pPr>
+      <w:r>
+        <w:rPr>
+          <w:highlight w:val="red"/>
+        </w:rPr>
+        <w:t xml:space="preserve">If you’d like to show watering animations when watering a berry plant, make sure to set BERRY_WATERING_SPRITES in 000_Settings to include file names for each of the trainers in your game. You must also include the appropriate images in the Graphics &gt; Characters folder (I suggest </w:t>
       </w:r>
       <w:hyperlink r:id="rId9" w:history="1">
         <w:proofErr w:type="spellStart"/>
         <w:r>
           <w:rPr>
             <w:rStyle w:val="Hyperlink"/>
+            <w:highlight w:val="red"/>
           </w:rPr>
           <w:t>Ulithium_Dragon</w:t>
         </w:r>
       </w:hyperlink>
       <w:r>
+        <w:rPr>
+          <w:highlight w:val="red"/>
+        </w:rPr>
         <w:t>’s</w:t>
       </w:r>
       <w:proofErr w:type="spellEnd"/>
       <w:r>
+        <w:rPr>
+          <w:highlight w:val="red"/>
+        </w:rPr>
         <w:t xml:space="preserve"> graphics)</w:t>
       </w:r>
     </w:p>
@@ -1266,8 +1318,14 @@
           <w:ilvl w:val="0"/>
           <w:numId w:val="14"/>
         </w:numPr>
-      </w:pPr>
-      <w:r>
+        <w:rPr>
+          <w:highlight w:val="red"/>
+        </w:rPr>
+      </w:pPr>
+      <w:r>
+        <w:rPr>
+          <w:highlight w:val="red"/>
+        </w:rPr>
         <w:t>You can also use graphics specific to different watering can items. Just add in graphics with the same names as the ones added in Step 1, but with “_&lt;CAN ID&gt;” appended to the file name, where &lt;CAN ID&gt; is the symbol of the watering can item.</w:t>
       </w:r>
     </w:p>
@@ -1278,38 +1336,56 @@
           <w:ilvl w:val="1"/>
           <w:numId w:val="14"/>
         </w:numPr>
-      </w:pPr>
-      <w:r>
-        <w:t xml:space="preserve">For instance, if your base graphic is called </w:t>
-      </w:r>
-      <w:r>
-        <w:t>"</w:t>
-      </w:r>
-      <w:proofErr w:type="spellStart"/>
-      <w:r>
+        <w:rPr>
+          <w:highlight w:val="red"/>
+        </w:rPr>
+      </w:pPr>
+      <w:r>
+        <w:rPr>
+          <w:highlight w:val="red"/>
+        </w:rPr>
+        <w:t>For instance, if your base graphic is called "</w:t>
+      </w:r>
+      <w:proofErr w:type="spellStart"/>
+      <w:r>
+        <w:rPr>
+          <w:highlight w:val="red"/>
+        </w:rPr>
         <w:t>girl_watering</w:t>
       </w:r>
       <w:proofErr w:type="spellEnd"/>
       <w:r>
-        <w:t>"</w:t>
-      </w:r>
-      <w:r>
-        <w:t xml:space="preserve"> and you want to include a unique graphic while using the </w:t>
-      </w:r>
-      <w:proofErr w:type="spellStart"/>
-      <w:r>
+        <w:rPr>
+          <w:highlight w:val="red"/>
+        </w:rPr>
+        <w:t xml:space="preserve">" and you want to include a unique graphic while using the </w:t>
+      </w:r>
+      <w:proofErr w:type="spellStart"/>
+      <w:r>
+        <w:rPr>
+          <w:highlight w:val="red"/>
+        </w:rPr>
         <w:t>Sprayduck</w:t>
       </w:r>
       <w:proofErr w:type="spellEnd"/>
       <w:r>
+        <w:rPr>
+          <w:highlight w:val="red"/>
+        </w:rPr>
         <w:t>, add a graphic called “</w:t>
       </w:r>
       <w:proofErr w:type="spellStart"/>
       <w:r>
+        <w:rPr>
+          <w:highlight w:val="red"/>
+        </w:rPr>
         <w:t>girl_watering_SPRAYDUCK</w:t>
       </w:r>
       <w:proofErr w:type="spellEnd"/>
       <w:r>
+        <w:rPr>
+          <w:highlight w:val="red"/>
+        </w:rPr>
         <w:t>”</w:t>
       </w:r>
     </w:p>
@@ -2385,6 +2461,7 @@
           <w:bCs/>
           <w:sz w:val="28"/>
           <w:szCs w:val="28"/>
+          <w:highlight w:val="red"/>
           <w:u w:val="single"/>
         </w:rPr>
       </w:pPr>
@@ -2394,6 +2471,7 @@
           <w:bCs/>
           <w:sz w:val="28"/>
           <w:szCs w:val="28"/>
+          <w:highlight w:val="red"/>
           <w:u w:val="single"/>
         </w:rPr>
         <w:t>Documentation</w:t>
@@ -2404,6 +2482,7 @@
         <w:rPr>
           <w:sz w:val="24"/>
           <w:szCs w:val="24"/>
+          <w:highlight w:val="red"/>
         </w:rPr>
       </w:pPr>
       <w:r>
@@ -2412,6 +2491,7 @@
           <w:bCs/>
           <w:sz w:val="24"/>
           <w:szCs w:val="24"/>
+          <w:highlight w:val="red"/>
         </w:rPr>
         <w:t>Functions</w:t>
       </w:r>
@@ -2422,14 +2502,16 @@
           <w:rFonts w:ascii="Source Code Pro" w:hAnsi="Source Code Pro"/>
           <w:sz w:val="20"/>
           <w:szCs w:val="20"/>
-        </w:rPr>
-      </w:pPr>
-      <w:proofErr w:type="spellStart"/>
-      <w:r>
-        <w:rPr>
-          <w:rFonts w:ascii="Source Code Pro" w:hAnsi="Source Code Pro"/>
-          <w:sz w:val="20"/>
-          <w:szCs w:val="20"/>
+          <w:highlight w:val="red"/>
+        </w:rPr>
+      </w:pPr>
+      <w:proofErr w:type="spellStart"/>
+      <w:r>
+        <w:rPr>
+          <w:rFonts w:ascii="Source Code Pro" w:hAnsi="Source Code Pro"/>
+          <w:sz w:val="20"/>
+          <w:szCs w:val="20"/>
+          <w:highlight w:val="red"/>
         </w:rPr>
         <w:t>pbMulchComposter</w:t>
       </w:r>
@@ -2439,10 +2521,14 @@
           <w:rFonts w:ascii="Source Code Pro" w:hAnsi="Source Code Pro"/>
           <w:sz w:val="20"/>
           <w:szCs w:val="20"/>
+          <w:highlight w:val="red"/>
         </w:rPr>
         <w:t xml:space="preserve"> </w:t>
       </w:r>
       <w:r>
+        <w:rPr>
+          <w:highlight w:val="red"/>
+        </w:rPr>
         <w:t>or</w:t>
       </w:r>
       <w:r>
@@ -2450,6 +2536,7 @@
           <w:rFonts w:ascii="Source Code Pro" w:hAnsi="Source Code Pro"/>
           <w:sz w:val="20"/>
           <w:szCs w:val="20"/>
+          <w:highlight w:val="red"/>
         </w:rPr>
         <w:t xml:space="preserve"> </w:t>
       </w:r>
@@ -2459,6 +2546,7 @@
           <w:rFonts w:ascii="Source Code Pro" w:hAnsi="Source Code Pro"/>
           <w:sz w:val="20"/>
           <w:szCs w:val="20"/>
+          <w:highlight w:val="red"/>
         </w:rPr>
         <w:t>pbComposter</w:t>
       </w:r>
@@ -2471,12 +2559,21 @@
           <w:ilvl w:val="0"/>
           <w:numId w:val="2"/>
         </w:numPr>
-      </w:pPr>
-      <w:r>
+        <w:rPr>
+          <w:highlight w:val="red"/>
+        </w:rPr>
+      </w:pPr>
+      <w:r>
+        <w:rPr>
+          <w:highlight w:val="red"/>
+        </w:rPr>
         <w:lastRenderedPageBreak/>
         <w:t xml:space="preserve">Description: </w:t>
       </w:r>
       <w:r>
+        <w:rPr>
+          <w:highlight w:val="red"/>
+        </w:rPr>
         <w:t>Opens a composter to turn berries into mulch. Requires Berry Core and Dex plugin. Define mulch recipes in 000_Settings.</w:t>
       </w:r>
     </w:p>

</xml_diff>